<commit_message>
fix: leere Rückseite in allen drei Vertragsvorlagen für doppelseitigen Druck
Nutzer hat in den Word-Vorlagen (Arbeitsvertrag/Werkmietvertrag/
Bankverbindung) jeweils eine zusätzliche leere Seite am Ende ergänzt, damit
sich die Dokumente sauber beidseitig ausdrucken lassen (jedes Dokument hat
jetzt eine gerade Seitenzahl: 4/2/2 statt vorher 3/1/1). Mit Node.js +
Word lokal end-to-end getestet (Einzeldokumente und die kombinierte
Anreisegruppen-Version mit 2 Personen, 16 statt vorher 10 Seiten) - alle
Platzhalter korrekt ersetzt, Seitenumbrüche und leere Seiten an den
richtigen Stellen, keine Artefakte.
</commit_message>
<xml_diff>
--- a/public/vertragsvorlagen/Arbeitsvertrag_Vorlage.docx
+++ b/public/vertragsvorlagen/Arbeitsvertrag_Vorlage.docx
@@ -143,23 +143,7 @@
           <w:sz w:val="22"/>
         </w:rPr>
         <w:tab/>
-        <w:t>Staatsangehörigkeit: «</w:t>
-      </w:r>
-      <w:proofErr w:type="spellStart"/>
-      <w:r>
-        <w:rPr>
-          <w:rFonts w:ascii="Arial" w:hAnsi="Arial" w:cs="Arial"/>
-          <w:sz w:val="22"/>
-        </w:rPr>
-        <w:t>Staatsangehoerigkeit</w:t>
-      </w:r>
-      <w:proofErr w:type="spellEnd"/>
-      <w:r>
-        <w:rPr>
-          <w:rFonts w:ascii="Arial" w:hAnsi="Arial" w:cs="Arial"/>
-          <w:sz w:val="22"/>
-        </w:rPr>
-        <w:t>»</w:t>
+        <w:t>Staatsangehörigkeit: «Staatsangehoerigkeit»</w:t>
       </w:r>
     </w:p>
     <w:p>
@@ -215,136 +199,52 @@
           <w:rFonts w:ascii="Arial" w:hAnsi="Arial" w:cs="Arial"/>
           <w:sz w:val="22"/>
         </w:rPr>
-        <w:t xml:space="preserve">Das Arbeitsverhältnis wird sachbefristet abgeschlossen, da der betriebliche Bedarf des </w:t>
-      </w:r>
-      <w:proofErr w:type="spellStart"/>
-      <w:proofErr w:type="gramStart"/>
-      <w:r>
-        <w:rPr>
-          <w:rFonts w:ascii="Arial" w:hAnsi="Arial" w:cs="Arial"/>
-          <w:sz w:val="22"/>
-        </w:rPr>
-        <w:t>AG's</w:t>
-      </w:r>
-      <w:proofErr w:type="spellEnd"/>
-      <w:proofErr w:type="gramEnd"/>
-      <w:r>
-        <w:rPr>
-          <w:rFonts w:ascii="Arial" w:hAnsi="Arial" w:cs="Arial"/>
-          <w:sz w:val="22"/>
-        </w:rPr>
-        <w:t xml:space="preserve"> an der Arbeitsleistung nur vorübergehend ist und durch die Natur der Sache und unabhängig von der Sachbefristung am nachstehenden Datum endet, ohne dass es einer Kündigung bedarf. Einer Fortsetzung über das Vertragsende hinaus wird bereits jetzt widersprochen.</w:t>
-      </w:r>
-    </w:p>
-    <w:p>
-      <w:pPr>
-        <w:rPr>
-          <w:rFonts w:ascii="Arial" w:hAnsi="Arial" w:cs="Arial"/>
-          <w:sz w:val="22"/>
-        </w:rPr>
-      </w:pPr>
-      <w:r>
-        <w:rPr>
-          <w:rFonts w:ascii="Arial" w:hAnsi="Arial" w:cs="Arial"/>
-          <w:sz w:val="22"/>
-        </w:rPr>
-        <w:t>Die Grundlage für die Beschäftigungsdauer ist die gesetzliche 90 Tage / 15 Wochen Regelung für den Zeitraum: vom «</w:t>
-      </w:r>
-      <w:proofErr w:type="spellStart"/>
-      <w:r>
-        <w:rPr>
-          <w:rFonts w:ascii="Arial" w:hAnsi="Arial" w:cs="Arial"/>
-          <w:sz w:val="22"/>
-        </w:rPr>
-        <w:t>ArbeitsbeginnDatum</w:t>
-      </w:r>
-      <w:proofErr w:type="spellEnd"/>
-      <w:r>
-        <w:rPr>
-          <w:rFonts w:ascii="Arial" w:hAnsi="Arial" w:cs="Arial"/>
-          <w:sz w:val="22"/>
-        </w:rPr>
-        <w:t>» bis «</w:t>
-      </w:r>
-      <w:proofErr w:type="spellStart"/>
-      <w:r>
-        <w:rPr>
-          <w:rFonts w:ascii="Arial" w:hAnsi="Arial" w:cs="Arial"/>
-          <w:sz w:val="22"/>
-        </w:rPr>
-        <w:t>ArbeitsendeDatum</w:t>
-      </w:r>
-      <w:proofErr w:type="spellEnd"/>
-      <w:r>
-        <w:rPr>
-          <w:rFonts w:ascii="Arial" w:hAnsi="Arial" w:cs="Arial"/>
-          <w:sz w:val="22"/>
-        </w:rPr>
-        <w:t>»</w:t>
-      </w:r>
-    </w:p>
-    <w:p>
-      <w:pPr>
-        <w:rPr>
-          <w:rFonts w:ascii="Arial" w:hAnsi="Arial" w:cs="Arial"/>
-          <w:sz w:val="22"/>
-        </w:rPr>
-      </w:pPr>
-      <w:r>
-        <w:rPr>
-          <w:rFonts w:ascii="Arial" w:hAnsi="Arial" w:cs="Arial"/>
-          <w:sz w:val="22"/>
-        </w:rPr>
-        <w:t xml:space="preserve">Vorzeitige Beendigung des Arbeitsverhältnisses: Mit der Entgegennahme des </w:t>
-      </w:r>
-      <w:proofErr w:type="spellStart"/>
-      <w:r>
-        <w:rPr>
-          <w:rFonts w:ascii="Arial" w:hAnsi="Arial" w:cs="Arial"/>
-          <w:sz w:val="22"/>
-        </w:rPr>
-        <w:t>Restentgeldes</w:t>
-      </w:r>
-      <w:proofErr w:type="spellEnd"/>
-      <w:r>
-        <w:rPr>
-          <w:rFonts w:ascii="Arial" w:hAnsi="Arial" w:cs="Arial"/>
-          <w:sz w:val="22"/>
-        </w:rPr>
-        <w:t xml:space="preserve"> vor Ablauf der geplanten Beschäftigungsdauer stimmt der AN mit seiner Unterschrift bei der Lohnauszahlung der fristlosen Beendigung des Arbeitsverhältnisses zu.</w:t>
-      </w:r>
-    </w:p>
-    <w:p>
-      <w:pPr>
-        <w:rPr>
-          <w:rFonts w:ascii="Arial" w:hAnsi="Arial" w:cs="Arial"/>
-          <w:sz w:val="22"/>
-        </w:rPr>
-      </w:pPr>
-      <w:r>
-        <w:rPr>
-          <w:rFonts w:ascii="Arial" w:hAnsi="Arial" w:cs="Arial"/>
-          <w:sz w:val="22"/>
-        </w:rPr>
-        <w:t xml:space="preserve">Der AN wird als Saisonarbeitskraft eingestellt und nach Weisung des </w:t>
-      </w:r>
-      <w:proofErr w:type="spellStart"/>
-      <w:proofErr w:type="gramStart"/>
-      <w:r>
-        <w:rPr>
-          <w:rFonts w:ascii="Arial" w:hAnsi="Arial" w:cs="Arial"/>
-          <w:sz w:val="22"/>
-        </w:rPr>
-        <w:t>AG's</w:t>
-      </w:r>
-      <w:proofErr w:type="spellEnd"/>
-      <w:proofErr w:type="gramEnd"/>
-      <w:r>
-        <w:rPr>
-          <w:rFonts w:ascii="Arial" w:hAnsi="Arial" w:cs="Arial"/>
-          <w:sz w:val="22"/>
-        </w:rPr>
-        <w:t xml:space="preserve"> mit folgenden Arbeiten beschäftigt:</w:t>
+        <w:t>Das Arbeitsverhältnis wird sachbefristet abgeschlossen, da der betriebliche Bedarf des AG's an der Arbeitsleistung nur vorübergehend ist und durch die Natur der Sache und unabhängig von der Sachbefristung am nachstehenden Datum endet, ohne dass es einer Kündigung bedarf. Einer Fortsetzung über das Vertragsende hinaus wird bereits jetzt widersprochen.</w:t>
+      </w:r>
+    </w:p>
+    <w:p>
+      <w:pPr>
+        <w:rPr>
+          <w:rFonts w:ascii="Arial" w:hAnsi="Arial" w:cs="Arial"/>
+          <w:sz w:val="22"/>
+        </w:rPr>
+      </w:pPr>
+      <w:r>
+        <w:rPr>
+          <w:rFonts w:ascii="Arial" w:hAnsi="Arial" w:cs="Arial"/>
+          <w:sz w:val="22"/>
+        </w:rPr>
+        <w:t>Die Grundlage für die Beschäftigungsdauer ist die gesetzliche 90 Tage / 15 Wochen Regelung für den Zeitraum: vom «ArbeitsbeginnDatum» bis «ArbeitsendeDatum»</w:t>
+      </w:r>
+    </w:p>
+    <w:p>
+      <w:pPr>
+        <w:rPr>
+          <w:rFonts w:ascii="Arial" w:hAnsi="Arial" w:cs="Arial"/>
+          <w:sz w:val="22"/>
+        </w:rPr>
+      </w:pPr>
+      <w:r>
+        <w:rPr>
+          <w:rFonts w:ascii="Arial" w:hAnsi="Arial" w:cs="Arial"/>
+          <w:sz w:val="22"/>
+        </w:rPr>
+        <w:t>Vorzeitige Beendigung des Arbeitsverhältnisses: Mit der Entgegennahme des Restentgeldes vor Ablauf der geplanten Beschäftigungsdauer stimmt der AN mit seiner Unterschrift bei der Lohnauszahlung der fristlosen Beendigung des Arbeitsverhältnisses zu.</w:t>
+      </w:r>
+    </w:p>
+    <w:p>
+      <w:pPr>
+        <w:rPr>
+          <w:rFonts w:ascii="Arial" w:hAnsi="Arial" w:cs="Arial"/>
+          <w:sz w:val="22"/>
+        </w:rPr>
+      </w:pPr>
+      <w:r>
+        <w:rPr>
+          <w:rFonts w:ascii="Arial" w:hAnsi="Arial" w:cs="Arial"/>
+          <w:sz w:val="22"/>
+        </w:rPr>
+        <w:t>Der AN wird als Saisonarbeitskraft eingestellt und nach Weisung des AG's mit folgenden Arbeiten beschäftigt:</w:t>
       </w:r>
     </w:p>
     <w:p>
@@ -459,25 +359,7 @@
           <w:sz w:val="22"/>
         </w:rPr>
         <w:lastRenderedPageBreak/>
-        <w:t xml:space="preserve">Der AN verpflichtet sich bei betrieblichen Erfordernissen auf Anordnung des </w:t>
-      </w:r>
-      <w:proofErr w:type="spellStart"/>
-      <w:proofErr w:type="gramStart"/>
-      <w:r>
-        <w:rPr>
-          <w:rFonts w:ascii="Arial" w:hAnsi="Arial" w:cs="Arial"/>
-          <w:sz w:val="22"/>
-        </w:rPr>
-        <w:t>AG's</w:t>
-      </w:r>
-      <w:proofErr w:type="spellEnd"/>
-      <w:proofErr w:type="gramEnd"/>
-      <w:r>
-        <w:rPr>
-          <w:rFonts w:ascii="Arial" w:hAnsi="Arial" w:cs="Arial"/>
-          <w:sz w:val="22"/>
-        </w:rPr>
-        <w:t xml:space="preserve"> Sonntags-, Feiertags-, Über- und Mehrarbeit zuschlagsfrei sowie Nachtarbeit zu leisten. Es gilt die Regelung des §5 Ziffer 6 Landarbeiter-Manteltarifvertrages für Hessen 2019 vom 28.08.2019 in der jeweils gültigen Fassung.</w:t>
+        <w:t>Der AN verpflichtet sich bei betrieblichen Erfordernissen auf Anordnung des AG's Sonntags-, Feiertags-, Über- und Mehrarbeit zuschlagsfrei sowie Nachtarbeit zu leisten. Es gilt die Regelung des §5 Ziffer 6 Landarbeiter-Manteltarifvertrages für Hessen 2019 vom 28.08.2019 in der jeweils gültigen Fassung.</w:t>
       </w:r>
     </w:p>
     <w:p>
@@ -1095,6 +977,21 @@
         </w:rPr>
         <w:tab/>
         <w:t>Arbeitnehmer (AN)</w:t>
+      </w:r>
+    </w:p>
+    <w:p>
+      <w:pPr>
+        <w:rPr>
+          <w:rFonts w:ascii="Arial" w:hAnsi="Arial" w:cs="Arial"/>
+          <w:sz w:val="22"/>
+        </w:rPr>
+      </w:pPr>
+      <w:r>
+        <w:rPr>
+          <w:rFonts w:ascii="Arial" w:hAnsi="Arial" w:cs="Arial"/>
+          <w:sz w:val="22"/>
+        </w:rPr>
+        <w:br w:type="page"/>
       </w:r>
     </w:p>
     <w:p>

</xml_diff>